<commit_message>
Logic Update Sprint 2
</commit_message>
<xml_diff>
--- a/docs/Program-Workflow.docx
+++ b/docs/Program-Workflow.docx
@@ -41,12 +41,15 @@
         <w:t xml:space="preserve"> is a web-based parking management system split into two sides: a public Customer Portal and a </w:t>
       </w:r>
       <w:r>
-        <w:t>protected Staff Dashboard. Customers can browse available slots, register a booking, and pay online or in cash â€” all without needing an account. Staff can monitor all incoming bookings, check vehicles in, and cancel reservations from the dash</w:t>
+        <w:t>protected Staff Dashboard. Customers can browse available slots, register a booking, and pay online or in cash</w:t>
+      </w:r>
+      <w:r>
+        <w:t>,</w:t>
       </w:r>
       <w:bookmarkStart w:id="0" w:name="_GoBack"/>
       <w:bookmarkEnd w:id="0"/>
       <w:r>
-        <w:t>board.</w:t>
+        <w:t xml:space="preserve"> all without needing an account. Staff can monitor all incoming bookings, check vehicles in, and cancel reservations from the dashboard.</w:t>
       </w:r>
     </w:p>
     <w:p/>
@@ -153,23 +156,32 @@
     </w:p>
     <w:p>
       <w:r>
-        <w:t>Step 1 â€” Slot Map: A visual grid shows all parking slots color-coded by status (green = Empty, red = Occupied, yellow = R</w:t>
-      </w:r>
-      <w:r>
-        <w:t>eserved, grey = Maintenance). The customer clicks a green slot to select it.</w:t>
-      </w:r>
-    </w:p>
-    <w:p>
-      <w:r>
-        <w:t>Step 2 â€” Details: The customer enters their Full Name, Phone Number (used as a tracking key), License Plate, Vehicle Type, and Arrival Time.</w:t>
-      </w:r>
-    </w:p>
-    <w:p>
-      <w:r>
-        <w:t>Step 3 â€” Payment: A summary is sho</w:t>
-      </w:r>
-      <w:r>
-        <w:t>wn. The customer selects either "Cash at Booth" or "</w:t>
+        <w:t>Step 1</w:t>
+      </w:r>
+      <w:r>
+        <w:t>: A visual grid separated into floors (zones) via a tab switcher. Slots are displayed with a realistic d</w:t>
+      </w:r>
+      <w:r>
+        <w:t>riveway layout and color-coded by status (green = Empty, red = Occupied, yellow = Reserved, grey = Maintenance). The customer clicks a green slot to select it.</w:t>
+      </w:r>
+    </w:p>
+    <w:p>
+      <w:r>
+        <w:t>Step 2</w:t>
+      </w:r>
+      <w:r>
+        <w:t xml:space="preserve">: The customer enters their Full Name, Phone Number (used as a tracking key), </w:t>
+      </w:r>
+      <w:r>
+        <w:t>License Plate, Vehicle Type, and Arrival Time.</w:t>
+      </w:r>
+    </w:p>
+    <w:p>
+      <w:r>
+        <w:t>Step 3</w:t>
+      </w:r>
+      <w:r>
+        <w:t>: A summary is shown. The customer selects either "Cash at Booth" or "</w:t>
       </w:r>
       <w:proofErr w:type="spellStart"/>
       <w:r>
@@ -210,10 +222,10 @@
     </w:p>
     <w:p>
       <w:r>
-        <w:t xml:space="preserve">Customers can look up all bookings they have made by entering </w:t>
-      </w:r>
-      <w:r>
-        <w:t>their Phone Number and License Plate. The results show the booking status (Pending, Checked In, Cancelled, Overdue), assigned slot, zone, payment method, and â€” if cancelled â€” the reason staff provided.</w:t>
+        <w:t>Customers can look up all bookings they have made by entering their Phone Number and License Plate. The results show the booking status (Pending, Checked In, Cancelled, Overdue), assigned slot, zone, payment method, and â€” if cancelle</w:t>
+      </w:r>
+      <w:r>
+        <w:t>d â€” the reason staff provided.</w:t>
       </w:r>
     </w:p>
     <w:p/>
@@ -254,10 +266,7 @@
     </w:p>
     <w:p>
       <w:r>
-        <w:t>S</w:t>
-      </w:r>
-      <w:r>
-        <w:t xml:space="preserve">taff authenticate at login.html using their username and plain-text password (development setting). On success, an access token is stored in </w:t>
+        <w:t xml:space="preserve">Staff authenticate at login.html using their username and plain-text password (development setting). On success, an access token is stored in </w:t>
       </w:r>
       <w:proofErr w:type="spellStart"/>
       <w:r>
@@ -265,10 +274,10 @@
       </w:r>
       <w:proofErr w:type="spellEnd"/>
       <w:r>
-        <w:t xml:space="preserve"> and used for all subsequent API calls. Admins and managers have access to all actions; attendants ca</w:t>
-      </w:r>
-      <w:r>
-        <w:t>n check in vehicles.</w:t>
+        <w:t xml:space="preserve"> and used for all </w:t>
+      </w:r>
+      <w:r>
+        <w:t>subsequent API calls. Admins and managers have access to all actions; attendants can check in vehicles.</w:t>
       </w:r>
     </w:p>
     <w:p>
@@ -298,17 +307,21 @@
     </w:p>
     <w:p>
       <w:r>
-        <w:t>System Overview: Shows global slot counts, occupancy per floor, vehicle type breakdown, and the parking map grid for Zone A a</w:t>
-      </w:r>
-      <w:r>
-        <w:t>nd Zone B.</w:t>
-      </w:r>
-    </w:p>
-    <w:p>
-      <w:r>
-        <w:t>Bookings: A searchable ledger of all advance reservations. Staff can search by name or plate number. Each row can be expanded to reveal action buttons.</w:t>
-      </w:r>
-    </w:p>
+        <w:t>System Overview: Shows global slot counts,</w:t>
+      </w:r>
+      <w:r>
+        <w:t xml:space="preserve"> occupancy per floor, vehicle type breakdown, and a live, interactive parking map preview equipped with floor switcher tabs and a realistic driveway layout.</w:t>
+      </w:r>
+    </w:p>
+    <w:p>
+      <w:r>
+        <w:t>Bookings: A searchable ledger of all advance reservations. Staff can search by name or plate number</w:t>
+      </w:r>
+      <w:r>
+        <w:t>. Each row can be expanded to reveal action buttons.</w:t>
+      </w:r>
+    </w:p>
+    <w:p/>
     <w:p>
       <w:pPr>
         <w:pStyle w:val="Heading2"/>
@@ -325,36 +338,46 @@
     </w:p>
     <w:p>
       <w:r>
-        <w:t>Check-In: Marks the booking as "Occupied" and flips the parking slot stat</w:t>
-      </w:r>
-      <w:r>
-        <w:t>us from Reserved to Occupied. Only works on active (Pending) bookings.</w:t>
-      </w:r>
-    </w:p>
-    <w:p>
-      <w:r>
-        <w:t>Cancel: Requires confirmation. Staff can optionally enter a reason for cancellation, which the customer will see on their tracking page. The slot is returned to Empty.</w:t>
-      </w:r>
-    </w:p>
-    <w:p>
-      <w:r>
-        <w:t xml:space="preserve">Remove from </w:t>
-      </w:r>
-      <w:r>
-        <w:t>History: Permanently deletes a finished or cancelled booking from the ledger. Cannot be applied to active bookings.</w:t>
-      </w:r>
-    </w:p>
-    <w:p>
-      <w:r>
-        <w:t>Mass Actions: Selecting multiple rows with checkboxes reveals a taskbar that can Check-In or Cancel all selected bookings at once.</w:t>
-      </w:r>
-    </w:p>
-    <w:p>
-      <w:r>
-        <w:t xml:space="preserve">Customer </w:t>
-      </w:r>
-      <w:r>
-        <w:t>Portal Link: The "Customer Portal" button in the Bookings header opens the customer booking page in a new tab for quick reference.</w:t>
+        <w:t>Check-In: Marks the booking as "Occupied" and flips the parking slot status from Reserved to Occupied. Only works on active (Pending) bookings.</w:t>
+      </w:r>
+    </w:p>
+    <w:p>
+      <w:r>
+        <w:t xml:space="preserve">Check-Out: Marks an Occupied booking </w:t>
+      </w:r>
+      <w:r>
+        <w:t>as "Checked-Out" and returns the slot to Empty.</w:t>
+      </w:r>
+    </w:p>
+    <w:p>
+      <w:r>
+        <w:t>Edit Slot: Allows staff to modify a Reserved booking by selecting a new empty slot within the same zone. A mandatory reason must be provided.</w:t>
+      </w:r>
+    </w:p>
+    <w:p>
+      <w:r>
+        <w:t>Cancel: Requires confirmation. Staff can optionally enter a reason</w:t>
+      </w:r>
+      <w:r>
+        <w:t xml:space="preserve"> for cancellation, which the customer will see on their tracking page. The slot is returned to Empty.</w:t>
+      </w:r>
+    </w:p>
+    <w:p>
+      <w:r>
+        <w:t>Remove from History: Permanently deletes a finished or cancelled booking from the ledger. Cannot be applied to active bookings.</w:t>
+      </w:r>
+    </w:p>
+    <w:p>
+      <w:r>
+        <w:t>Mass Actions: Selecting mu</w:t>
+      </w:r>
+      <w:r>
+        <w:t>ltiple rows with checkboxes reveals a taskbar that can Check-In, Check-Out, or Cancel all selected bookings at once.</w:t>
+      </w:r>
+    </w:p>
+    <w:p>
+      <w:r>
+        <w:t>Customer Portal Link: The "Customer Entry" button in the main home opens the customer booking page for quick access.</w:t>
       </w:r>
     </w:p>
     <w:p/>
@@ -383,7 +406,7 @@
         <w:rPr>
           <w:color w:val="auto"/>
         </w:rPr>
-        <w:t xml:space="preserve"> Sandbox â€” How to Test</w:t>
+        <w:t xml:space="preserve"> Sandbox </w:t>
       </w:r>
     </w:p>
     <w:p>
@@ -423,10 +446,7 @@
       </w:r>
       <w:proofErr w:type="spellEnd"/>
       <w:r>
-        <w:t>): J8</w:t>
-      </w:r>
-      <w:r>
-        <w:t>QYH7P5CJ37NR5E9WFMH30AGZ0AFEZO</w:t>
+        <w:t>): J8QYH7P5CJ37NR5E9WFMH30AGZ0AFEZO</w:t>
       </w:r>
     </w:p>
     <w:p>
@@ -436,7 +456,11 @@
     </w:p>
     <w:p>
       <w:r>
-        <w:t>Merchant Admin: https://sandbox.vnpayment.vn/merchantv2/ (login: phamankhangcm@gmail.com)</w:t>
+        <w:lastRenderedPageBreak/>
+        <w:t>Merchant Admin: https://sandbox.vnpayment.vn/merchantv2/ (</w:t>
+      </w:r>
+      <w:r>
+        <w:t>login: phamankhangcm@gmail.com)</w:t>
       </w:r>
     </w:p>
     <w:p>
@@ -455,10 +479,7 @@
     </w:p>
     <w:p>
       <w:r>
-        <w:t>1. Open customer/book.html in a browser (w</w:t>
-      </w:r>
-      <w:r>
-        <w:t>ith Tomcat running locally on port 8080).</w:t>
+        <w:t>1. Open customer/book.html in a browser (with Tomcat running locally on port 8080).</w:t>
       </w:r>
     </w:p>
     <w:p>
@@ -468,8 +489,10 @@
     </w:p>
     <w:p>
       <w:r>
-        <w:lastRenderedPageBreak/>
-        <w:t>3. Fill in your name, phone, license plate, vehicle type, and arrival time.</w:t>
+        <w:t>3. Fill in your name, phone, license plate, vehicle type, a</w:t>
+      </w:r>
+      <w:r>
+        <w:t>nd arrival time.</w:t>
       </w:r>
     </w:p>
     <w:p>
@@ -487,10 +510,7 @@
     </w:p>
     <w:p>
       <w:r>
-        <w:t>5. You will be re</w:t>
-      </w:r>
-      <w:r>
-        <w:t xml:space="preserve">directed to the </w:t>
+        <w:t xml:space="preserve">5. You will be redirected to the </w:t>
       </w:r>
       <w:proofErr w:type="spellStart"/>
       <w:r>
@@ -511,7 +531,10 @@
       </w:r>
       <w:proofErr w:type="spellEnd"/>
       <w:r>
-        <w:t xml:space="preserve"> sandbox, use the following test card: Bank: NCB, Card Number: 9704198526191432198, Cardholder Name: NGUYEN VAN A, Issue Date: 07/15, OTP: 123456.</w:t>
+        <w:t xml:space="preserve"> sandbox, use the following test card: Bank: NCB, Card Number: 9704198526191432198, Cardholder</w:t>
+      </w:r>
+      <w:r>
+        <w:t xml:space="preserve"> Name: NGUYEN VAN A, Issue Date: 07/15, OTP: 123456.</w:t>
       </w:r>
     </w:p>
     <w:p>
@@ -524,15 +547,15 @@
       </w:r>
       <w:proofErr w:type="spellEnd"/>
       <w:r>
-        <w:t xml:space="preserve"> redirects you back to book</w:t>
-      </w:r>
-      <w:r>
-        <w:t>.html with a success confirmation overlay.</w:t>
-      </w:r>
-    </w:p>
-    <w:p>
-      <w:r>
-        <w:t>8. Log in as staff on admin/dashboard.html and go to the Bookings tab â€” your booking appears with status "Pending" and payment method "</w:t>
+        <w:t xml:space="preserve"> redirects you back to book.html with a success confirmation overlay.</w:t>
+      </w:r>
+    </w:p>
+    <w:p>
+      <w:r>
+        <w:t>8. Log in as staff on admin/dashboard.html and go to the Bookings tab â€” your booking appears with status "Pe</w:t>
+      </w:r>
+      <w:r>
+        <w:t>nding" and payment method "</w:t>
       </w:r>
       <w:proofErr w:type="spellStart"/>
       <w:r>
@@ -545,10 +568,7 @@
     </w:p>
     <w:p>
       <w:r>
-        <w:t>9. Click the row to expand it and click "Check-In" to simulate the c</w:t>
-      </w:r>
-      <w:r>
-        <w:t>ar arriving.</w:t>
+        <w:t>9. Click the row to expand it and click "Check-In" to simulate the car arriving.</w:t>
       </w:r>
     </w:p>
     <w:p>
@@ -572,7 +592,10 @@
     </w:p>
     <w:p>
       <w:r>
-        <w:t>- The return URL is handled by PaymentController.java at /</w:t>
+        <w:t xml:space="preserve">- The </w:t>
+      </w:r>
+      <w:r>
+        <w:t>return URL is handled by PaymentController.java at /</w:t>
       </w:r>
       <w:proofErr w:type="spellStart"/>
       <w:r>
@@ -588,10 +611,7 @@
       </w:r>
       <w:proofErr w:type="spellEnd"/>
       <w:r>
-        <w:t xml:space="preserve"> redirects the browser th</w:t>
-      </w:r>
-      <w:r>
-        <w:t>ere after payment.</w:t>
+        <w:t xml:space="preserve"> redirects the browser there after payment.</w:t>
       </w:r>
     </w:p>
     <w:p>
@@ -604,15 +624,15 @@
       </w:r>
       <w:proofErr w:type="spellEnd"/>
       <w:r>
-        <w:t xml:space="preserve"> cannot call our server directly (no IPN). We rely only on the browser return redirect, which is sufficient for sandbox testing.</w:t>
-      </w:r>
-    </w:p>
-    <w:p>
-      <w:r>
-        <w:t>- If two customers pick the same slot simultaneously, the first to</w:t>
-      </w:r>
-      <w:r>
-        <w:t xml:space="preserve"> return from </w:t>
+        <w:t xml:space="preserve"> cannot call our server directly (no IPN). We rely only on the browser return redirect, wh</w:t>
+      </w:r>
+      <w:r>
+        <w:t>ich is sufficient for sandbox testing.</w:t>
+      </w:r>
+    </w:p>
+    <w:p>
+      <w:r>
+        <w:t xml:space="preserve">- If two customers pick the same slot simultaneously, the first to return from </w:t>
       </w:r>
       <w:proofErr w:type="spellStart"/>
       <w:r>
@@ -625,7 +645,10 @@
     </w:p>
     <w:p>
       <w:r>
-        <w:t xml:space="preserve">- These are SANDBOX credentials. Do not use them in production. Request production keys from </w:t>
+        <w:t>- These are SA</w:t>
+      </w:r>
+      <w:r>
+        <w:t xml:space="preserve">NDBOX credentials. Do not use them in production. Request production keys from </w:t>
       </w:r>
       <w:proofErr w:type="spellStart"/>
       <w:r>
@@ -633,10 +656,7 @@
       </w:r>
       <w:proofErr w:type="spellEnd"/>
       <w:r>
-        <w:t xml:space="preserve"> when ready to go liv</w:t>
-      </w:r>
-      <w:r>
-        <w:t>e.</w:t>
+        <w:t xml:space="preserve"> when ready to go live.</w:t>
       </w:r>
     </w:p>
     <w:p/>
@@ -655,10 +675,12 @@
       </w:r>
     </w:p>
     <w:p>
+      <w:proofErr w:type="gramStart"/>
       <w:r>
         <w:t>GET  /</w:t>
       </w:r>
       <w:proofErr w:type="spellStart"/>
+      <w:proofErr w:type="gramEnd"/>
       <w:r>
         <w:t>api</w:t>
       </w:r>
@@ -668,32 +690,36 @@
       </w:r>
     </w:p>
     <w:p>
+      <w:proofErr w:type="gramStart"/>
       <w:r>
         <w:t>GET  /</w:t>
       </w:r>
       <w:proofErr w:type="spellStart"/>
+      <w:proofErr w:type="gramEnd"/>
       <w:r>
         <w:t>api</w:t>
       </w:r>
       <w:proofErr w:type="spellEnd"/>
       <w:r>
-        <w:t>/v1/slots/status          â€” Public. Returns all slots with status (for slot map).</w:t>
-      </w:r>
-    </w:p>
-    <w:p>
+        <w:t xml:space="preserve">/v1/slots/status      </w:t>
+      </w:r>
+      <w:r>
+        <w:t xml:space="preserve">    â€” Public. Returns all slots with status (for slot map).</w:t>
+      </w:r>
+    </w:p>
+    <w:p>
+      <w:proofErr w:type="gramStart"/>
       <w:r>
         <w:t>GET  /</w:t>
       </w:r>
       <w:proofErr w:type="spellStart"/>
+      <w:proofErr w:type="gramEnd"/>
       <w:r>
         <w:t>api</w:t>
       </w:r>
       <w:proofErr w:type="spellEnd"/>
       <w:r>
-        <w:t xml:space="preserve">/v1/payment/slots         â€” </w:t>
-      </w:r>
-      <w:r>
-        <w:t>Public. Returns all slots with zone info for the booking map.</w:t>
+        <w:t>/v1/payment/slots         â€” Public. Returns all slots with zone info for the booking map.</w:t>
       </w:r>
     </w:p>
     <w:p>
@@ -714,14 +740,20 @@
       </w:r>
       <w:proofErr w:type="spellEnd"/>
       <w:r>
-        <w:t xml:space="preserve"> flow.</w:t>
-      </w:r>
-    </w:p>
-    <w:p>
-      <w:r>
+        <w:t xml:space="preserve"> fl</w:t>
+      </w:r>
+      <w:r>
+        <w:t>ow.</w:t>
+      </w:r>
+    </w:p>
+    <w:p>
+      <w:proofErr w:type="gramStart"/>
+      <w:r>
+        <w:lastRenderedPageBreak/>
         <w:t>GET  /</w:t>
       </w:r>
       <w:proofErr w:type="spellStart"/>
+      <w:proofErr w:type="gramEnd"/>
       <w:r>
         <w:t>api</w:t>
       </w:r>
@@ -735,17 +767,16 @@
       </w:r>
       <w:proofErr w:type="spellEnd"/>
       <w:r>
-        <w:t xml:space="preserve"> callback). Verifies hash and finalizes booki</w:t>
-      </w:r>
-      <w:r>
-        <w:t>ng.</w:t>
-      </w:r>
-    </w:p>
-    <w:p>
+        <w:t xml:space="preserve"> callback). Verifies hash and finalizes booking.</w:t>
+      </w:r>
+    </w:p>
+    <w:p>
+      <w:proofErr w:type="gramStart"/>
       <w:r>
         <w:t>GET  /</w:t>
       </w:r>
       <w:proofErr w:type="spellStart"/>
+      <w:proofErr w:type="gramEnd"/>
       <w:r>
         <w:t>api</w:t>
       </w:r>
@@ -776,19 +807,18 @@
       </w:r>
     </w:p>
     <w:p>
+      <w:proofErr w:type="gramStart"/>
       <w:r>
         <w:t>GET  /</w:t>
       </w:r>
       <w:proofErr w:type="spellStart"/>
+      <w:proofErr w:type="gramEnd"/>
       <w:r>
         <w:t>api</w:t>
       </w:r>
       <w:proofErr w:type="spellEnd"/>
       <w:r>
-        <w:t>/v1/bookings/list         â€” Staff only (Bearer token). Returns al</w:t>
-      </w:r>
-      <w:r>
-        <w:t>l bookings.</w:t>
+        <w:t>/v1/bookings/list         â€” Staff only (Bearer token). Returns all bookings.</w:t>
       </w:r>
     </w:p>
     <w:p>
@@ -814,7 +844,22 @@
     </w:p>
     <w:p>
       <w:r>
-        <w:lastRenderedPageBreak/>
+        <w:t>POST /</w:t>
+      </w:r>
+      <w:proofErr w:type="spellStart"/>
+      <w:r>
+        <w:t>api</w:t>
+      </w:r>
+      <w:proofErr w:type="spellEnd"/>
+      <w:r>
+        <w:t>/v1/bookings/checkout     â€” Staff only. Marks a bo</w:t>
+      </w:r>
+      <w:r>
+        <w:t>oking as checked out.</w:t>
+      </w:r>
+    </w:p>
+    <w:p>
+      <w:r>
         <w:t>DELETE /</w:t>
       </w:r>
       <w:proofErr w:type="spellStart"/>
@@ -836,23 +881,25 @@
       </w:r>
       <w:proofErr w:type="spellEnd"/>
       <w:r>
-        <w:t xml:space="preserve">/v1/bookings/remove     â€” Staff only. Permanently removes </w:t>
-      </w:r>
-      <w:r>
-        <w:t>a booking from history.</w:t>
-      </w:r>
-    </w:p>
-    <w:p>
+        <w:t>/v1/bookings/remove     â€” Staff only. Permanently removes a booking from history.</w:t>
+      </w:r>
+    </w:p>
+    <w:p>
+      <w:proofErr w:type="gramStart"/>
       <w:r>
         <w:t>PUT  /</w:t>
       </w:r>
       <w:proofErr w:type="spellStart"/>
+      <w:proofErr w:type="gramEnd"/>
       <w:r>
         <w:t>api</w:t>
       </w:r>
       <w:proofErr w:type="spellEnd"/>
       <w:r>
-        <w:t>/v1/bookings/edit         â€” Staff only. Updates booking details.</w:t>
+        <w:t>/v1/bookings/edit         â€” Staff onl</w:t>
+      </w:r>
+      <w:r>
+        <w:t>y. Updates booking slot with mandatory reason.</w:t>
       </w:r>
     </w:p>
     <w:p/>
@@ -872,10 +919,23 @@
     </w:p>
     <w:p>
       <w:r>
-        <w:t>-</w:t>
-      </w:r>
-      <w:r>
-        <w:t xml:space="preserve"> Booking table: Added </w:t>
+        <w:t xml:space="preserve">Run the updated </w:t>
+      </w:r>
+      <w:proofErr w:type="spellStart"/>
+      <w:r>
+        <w:t>SmartParkingDB.sql</w:t>
+      </w:r>
+      <w:proofErr w:type="spellEnd"/>
+      <w:r>
+        <w:t xml:space="preserve"> file in docs/ against your SQL Server instance before starting. The script drops all existing tables and recreates them with the new schema. Key cha</w:t>
+      </w:r>
+      <w:r>
+        <w:t>nges in Sprint 2:</w:t>
+      </w:r>
+    </w:p>
+    <w:p>
+      <w:r>
+        <w:t xml:space="preserve">- Booking table: Added </w:t>
       </w:r>
       <w:proofErr w:type="spellStart"/>
       <w:r>
@@ -920,10 +980,7 @@
     </w:p>
     <w:p>
       <w:r>
-        <w:t>- Booking status values: active (pending arrival), occupied (checked in), cance</w:t>
-      </w:r>
-      <w:r>
-        <w:t>led.</w:t>
+        <w:t>- Booking status values: active (pending arrival), occupied (checked in), checked-out, canceled.</w:t>
       </w:r>
     </w:p>
     <w:p>
@@ -936,7 +993,13 @@
       </w:r>
       <w:proofErr w:type="spellEnd"/>
       <w:r>
-        <w:t>: Expanded from 6 slots to 30 slots (10 Sedan in Zone A, 8 SUV in Zone B, 12 Motorbike in Zone C).</w:t>
+        <w:t>: Expanded to 75 slot</w:t>
+      </w:r>
+      <w:r>
+        <w:t>s (25 Sed</w:t>
+      </w:r>
+      <w:r>
+        <w:t>an in Zone A, 20 SUV in Zone B, 30 Motorbike in Zone C).</w:t>
       </w:r>
     </w:p>
     <w:sectPr>

</xml_diff>